<commit_message>
docs: finalize phase 1-3 report and complete team workbook for member 1
</commit_message>
<xml_diff>
--- a/524H0057_OnGiaKhiem_524H0069_VoNguyenPhucThinh_524H0052_NguyenNhatHuy.docx
+++ b/524H0057_OnGiaKhiem_524H0069_VoNguyenPhucThinh_524H0052_NguyenNhatHuy.docx
@@ -1785,6 +1785,9 @@
       <w:pPr>
         <w:spacing w:after="100"/>
         <w:jc w:val="center"/>
+        <w:rPr>
+          <w:lang w:val="en-US"/>
+        </w:rPr>
       </w:pPr>
       <w:r>
         <w:rPr>
@@ -1793,8 +1796,20 @@
           <w:sz w:val="26"/>
           <w:szCs w:val="26"/>
         </w:rPr>
-        <w:t>Group [XX]</w:t>
+        <w:t xml:space="preserve">Group </w:t>
       </w:r>
+      <w:r>
+        <w:rPr>
+          <w:b/>
+          <w:bCs/>
+          <w:sz w:val="26"/>
+          <w:szCs w:val="26"/>
+          <w:lang w:val="en-US"/>
+        </w:rPr>
+        <w:t>14</w:t>
+      </w:r>
+      <w:bookmarkStart w:id="0" w:name="_GoBack"/>
+      <w:bookmarkEnd w:id="0"/>
     </w:p>
     <w:p>
       <w:pPr>
@@ -2166,12 +2181,12 @@
         <w:keepNext/>
         <w:pageBreakBefore/>
       </w:pPr>
-      <w:bookmarkStart w:id="0" w:name="_Toc243431538"/>
+      <w:bookmarkStart w:id="1" w:name="_Toc243431538"/>
       <w:r>
         <w:lastRenderedPageBreak/>
         <w:t>Table of Contents</w:t>
       </w:r>
-      <w:bookmarkEnd w:id="0"/>
+      <w:bookmarkEnd w:id="1"/>
     </w:p>
     <w:sdt>
       <w:sdtPr>
@@ -5008,23 +5023,23 @@
         <w:keepNext/>
         <w:pageBreakBefore/>
       </w:pPr>
-      <w:bookmarkStart w:id="1" w:name="_Toc243431539"/>
+      <w:bookmarkStart w:id="2" w:name="_Toc243431539"/>
       <w:r>
         <w:lastRenderedPageBreak/>
         <w:t>1. Introduction</w:t>
       </w:r>
-      <w:bookmarkEnd w:id="1"/>
+      <w:bookmarkEnd w:id="2"/>
     </w:p>
     <w:p>
       <w:pPr>
         <w:pStyle w:val="Heading2"/>
         <w:keepNext/>
       </w:pPr>
-      <w:bookmarkStart w:id="2" w:name="_Toc243431540"/>
+      <w:bookmarkStart w:id="3" w:name="_Toc243431540"/>
       <w:r>
         <w:t>1.1 Purpose and Scope</w:t>
       </w:r>
-      <w:bookmarkEnd w:id="2"/>
+      <w:bookmarkEnd w:id="3"/>
     </w:p>
     <w:p>
       <w:pPr>
@@ -5035,10 +5050,6 @@
         </w:rPr>
       </w:pPr>
       <w:r>
-        <w:rPr>
-          <w:sz w:val="19"/>
-          <w:szCs w:val="19"/>
-        </w:rPr>
         <w:t>This report details the requirements engineering, UML system modeling, architectural design, and software implementation for the Ticket Vendor Machine (TVM) system, which serves as a core self-service kiosk within the urban Smart Ticketing System. The scope of this project covers passenger interactions for destination selection, ticket category configuration, multi-channel payment processing (Credit/Debit Card and dynamic QR Code/E-Wallet), physical barcode ticket printing, and real-time transaction timeout and error handling. Central transport scheduling, physical hardware maintenance operations, and backend banking ERP systems are out of scope for this implementation.</w:t>
       </w:r>
     </w:p>
@@ -5047,50 +5058,18 @@
         <w:pStyle w:val="Heading2"/>
         <w:keepNext/>
       </w:pPr>
-      <w:bookmarkStart w:id="3" w:name="_Toc243431541"/>
+      <w:bookmarkStart w:id="4" w:name="_Toc243431541"/>
       <w:r>
         <w:t>1.2 Problem Statement in Our Own Words</w:t>
       </w:r>
-      <w:bookmarkEnd w:id="3"/>
-    </w:p>
-    <w:p>
-      <w:pPr>
-        <w:spacing w:after="100" w:line="260" w:lineRule="auto"/>
-      </w:pPr>
-      <w:r>
-        <w:rPr>
-          <w:b/>
-          <w:bCs/>
-          <w:i/>
-          <w:iCs/>
-          <w:color w:val="7F7F7F"/>
-          <w:sz w:val="19"/>
-          <w:szCs w:val="19"/>
-        </w:rPr>
-        <w:t xml:space="preserve">Guidance (delete before submitting): </w:t>
-      </w:r>
-      <w:r>
-        <w:rPr>
-          <w:i/>
-          <w:iCs/>
-          <w:color w:val="7F7F7F"/>
-          <w:sz w:val="19"/>
-          <w:szCs w:val="19"/>
-        </w:rPr>
-        <w:t>Summarize the business context: ticket types, payment modes (Credit Card, QR Code linked to a banking system, Digital Wallet), the passenger interaction, and the ambiguities you found. Do not copy the assignment text.</w:t>
-      </w:r>
+      <w:bookmarkEnd w:id="4"/>
     </w:p>
     <w:p>
       <w:pPr>
         <w:spacing w:after="100"/>
       </w:pPr>
       <w:r>
-        <w:rPr>
-          <w:color w:val="1F4E9A"/>
-          <w:sz w:val="21"/>
-          <w:szCs w:val="21"/>
-        </w:rPr>
-        <w:t>[Problem statement]</w:t>
+        <w:t>The Smart Ticketing System (TVM) is an automated self-service kiosk operating in public transport stations. It allows passengers to select destinations, ticket quantities, and fare categories, with payment supported via Contactless Credit/Debit Cards and Dynamic QR Codes (E-Wallet/Banking). Uncovered domain complexities include enforcing strict 60-second online payment timeouts to avoid unverified passenger charges, gracefully handling physical ticket printer paper-out/jam hardware faults with automated refunds, and allowing safe transaction cancellation at any pre-payment stage.</w:t>
       </w:r>
     </w:p>
     <w:p>
@@ -5098,11 +5077,11 @@
         <w:pStyle w:val="Heading2"/>
         <w:keepNext/>
       </w:pPr>
-      <w:bookmarkStart w:id="4" w:name="_Toc243431542"/>
+      <w:bookmarkStart w:id="5" w:name="_Toc243431542"/>
       <w:r>
         <w:t>1.3 Team and Roles</w:t>
       </w:r>
-      <w:bookmarkEnd w:id="4"/>
+      <w:bookmarkEnd w:id="5"/>
     </w:p>
     <w:tbl>
       <w:tblPr>
@@ -6000,23 +5979,23 @@
         <w:keepNext/>
         <w:pageBreakBefore/>
       </w:pPr>
-      <w:bookmarkStart w:id="5" w:name="_Toc243431543"/>
+      <w:bookmarkStart w:id="6" w:name="_Toc243431543"/>
       <w:r>
         <w:lastRenderedPageBreak/>
         <w:t>2. Phase 1: Requirements Engineering (20 marks)</w:t>
       </w:r>
-      <w:bookmarkEnd w:id="5"/>
+      <w:bookmarkEnd w:id="6"/>
     </w:p>
     <w:p>
       <w:pPr>
         <w:pStyle w:val="Heading2"/>
         <w:keepNext/>
       </w:pPr>
-      <w:bookmarkStart w:id="6" w:name="_Toc243431544"/>
+      <w:bookmarkStart w:id="7" w:name="_Toc243431544"/>
       <w:r>
         <w:t>2.1 Clarification Q&amp;A (5 marks)</w:t>
       </w:r>
-      <w:bookmarkEnd w:id="6"/>
+      <w:bookmarkEnd w:id="7"/>
     </w:p>
     <w:tbl>
       <w:tblPr>
@@ -6838,11 +6817,11 @@
         <w:pStyle w:val="Heading2"/>
         <w:keepNext/>
       </w:pPr>
-      <w:bookmarkStart w:id="7" w:name="_Toc243431545"/>
+      <w:bookmarkStart w:id="8" w:name="_Toc243431545"/>
       <w:r>
         <w:t>2.2 Requirements Specification (15 marks)</w:t>
       </w:r>
-      <w:bookmarkEnd w:id="7"/>
+      <w:bookmarkEnd w:id="8"/>
     </w:p>
     <w:p>
       <w:pPr>
@@ -6898,11 +6877,11 @@
         <w:pStyle w:val="Heading3"/>
         <w:keepNext/>
       </w:pPr>
-      <w:bookmarkStart w:id="8" w:name="_Toc243431546"/>
+      <w:bookmarkStart w:id="9" w:name="_Toc243431546"/>
       <w:r>
         <w:t>2.2.1 Functional Requirements</w:t>
       </w:r>
-      <w:bookmarkEnd w:id="8"/>
+      <w:bookmarkEnd w:id="9"/>
     </w:p>
     <w:tbl>
       <w:tblPr>
@@ -8303,11 +8282,11 @@
         <w:pStyle w:val="Heading3"/>
         <w:keepNext/>
       </w:pPr>
-      <w:bookmarkStart w:id="9" w:name="_Toc243431547"/>
+      <w:bookmarkStart w:id="10" w:name="_Toc243431547"/>
       <w:r>
         <w:t>2.2.2 Non-Functional Requirements</w:t>
       </w:r>
-      <w:bookmarkEnd w:id="9"/>
+      <w:bookmarkEnd w:id="10"/>
     </w:p>
     <w:p>
       <w:pPr>
@@ -9361,11 +9340,11 @@
         <w:pStyle w:val="Heading3"/>
         <w:keepNext/>
       </w:pPr>
-      <w:bookmarkStart w:id="10" w:name="_Toc243431548"/>
+      <w:bookmarkStart w:id="11" w:name="_Toc243431548"/>
       <w:r>
         <w:t>2.2.3 Domain Requirements</w:t>
       </w:r>
-      <w:bookmarkEnd w:id="10"/>
+      <w:bookmarkEnd w:id="11"/>
     </w:p>
     <w:p>
       <w:pPr>
@@ -9855,34 +9834,34 @@
         <w:keepNext/>
         <w:pageBreakBefore/>
       </w:pPr>
-      <w:bookmarkStart w:id="11" w:name="_Toc243431549"/>
+      <w:bookmarkStart w:id="12" w:name="_Toc243431549"/>
       <w:r>
         <w:lastRenderedPageBreak/>
         <w:t>3. Phase 2: UML Modeling &amp; System Design (35 marks)</w:t>
       </w:r>
-      <w:bookmarkEnd w:id="11"/>
+      <w:bookmarkEnd w:id="12"/>
     </w:p>
     <w:p>
       <w:pPr>
         <w:pStyle w:val="Heading2"/>
         <w:keepNext/>
       </w:pPr>
-      <w:bookmarkStart w:id="12" w:name="_Toc243431550"/>
+      <w:bookmarkStart w:id="13" w:name="_Toc243431550"/>
       <w:r>
         <w:t>3.1 Use Case Modeling (10 marks)</w:t>
       </w:r>
-      <w:bookmarkEnd w:id="12"/>
+      <w:bookmarkEnd w:id="13"/>
     </w:p>
     <w:p>
       <w:pPr>
         <w:pStyle w:val="Heading3"/>
         <w:keepNext/>
       </w:pPr>
-      <w:bookmarkStart w:id="13" w:name="_Toc243431551"/>
+      <w:bookmarkStart w:id="14" w:name="_Toc243431551"/>
       <w:r>
         <w:t>3.1.1 Use Case Diagram</w:t>
       </w:r>
-      <w:bookmarkEnd w:id="13"/>
+      <w:bookmarkEnd w:id="14"/>
     </w:p>
     <w:p>
       <w:pPr>
@@ -9934,11 +9913,11 @@
         <w:pStyle w:val="Heading3"/>
         <w:keepNext/>
       </w:pPr>
-      <w:bookmarkStart w:id="14" w:name="_Toc243431552"/>
+      <w:bookmarkStart w:id="15" w:name="_Toc243431552"/>
       <w:r>
         <w:t>3.1.2 Actors and Use Case List</w:t>
       </w:r>
-      <w:bookmarkEnd w:id="14"/>
+      <w:bookmarkEnd w:id="15"/>
     </w:p>
     <w:tbl>
       <w:tblPr>
@@ -10296,7 +10275,7 @@
                 <w:sz w:val="19"/>
                 <w:szCs w:val="19"/>
               </w:rPr>
-              <w:t>Passenger</w:t>
+              <w:t>Pay via Credit Card</w:t>
             </w:r>
           </w:p>
         </w:tc>
@@ -10429,7 +10408,7 @@
                 <w:sz w:val="19"/>
                 <w:szCs w:val="19"/>
               </w:rPr>
-              <w:t>Passenger</w:t>
+              <w:t>Pay via QR Code</w:t>
             </w:r>
           </w:p>
         </w:tc>
@@ -10772,11 +10751,11 @@
         <w:pStyle w:val="Heading3"/>
         <w:keepNext/>
       </w:pPr>
-      <w:bookmarkStart w:id="15" w:name="_Toc243431553"/>
+      <w:bookmarkStart w:id="16" w:name="_Toc243431553"/>
       <w:r>
         <w:t>3.1.3 Use Case Descriptions</w:t>
       </w:r>
-      <w:bookmarkEnd w:id="15"/>
+      <w:bookmarkEnd w:id="16"/>
     </w:p>
     <w:p>
       <w:pPr>
@@ -10805,8 +10784,6 @@
         </w:rPr>
         <w:t>Buy a ticket</w:t>
       </w:r>
-      <w:bookmarkStart w:id="16" w:name="_GoBack"/>
-      <w:bookmarkEnd w:id="16"/>
     </w:p>
     <w:tbl>
       <w:tblPr>

</xml_diff>

<commit_message>
docs: complete Use Case diagram, sync 8 Q&As, resolve docx placeholders and finalize team workbook
</commit_message>
<xml_diff>
--- a/524H0057_OnGiaKhiem_524H0069_VoNguyenPhucThinh_524H0052_NguyenNhatHuy.docx
+++ b/524H0057_OnGiaKhiem_524H0069_VoNguyenPhucThinh_524H0052_NguyenNhatHuy.docx
@@ -6676,6 +6676,266 @@
           </w:p>
         </w:tc>
       </w:tr>
+      <w:tr>
+        <w:tc>
+          <w:tcPr>
+            <w:tcW w:type="dxa" w:w="800"/>
+          </w:tcPr>
+          <w:p>
+            <w:r>
+              <w:t>Q04</w:t>
+            </w:r>
+          </w:p>
+        </w:tc>
+        <w:tc>
+          <w:tcPr>
+            <w:tcW w:type="dxa" w:w="2300"/>
+          </w:tcPr>
+          <w:p>
+            <w:r>
+              <w:t>Can a user purchase multiple tickets for different fare classes (Adult, Child, Senior) in one transaction, and what is the maximum ticket limit?</w:t>
+            </w:r>
+          </w:p>
+        </w:tc>
+        <w:tc>
+          <w:tcPr>
+            <w:tcW w:type="dxa" w:w="2300"/>
+          </w:tcPr>
+          <w:p>
+            <w:r>
+              <w:t>Yes, passengers can select up to 5 tickets per transaction across Standard Adult, Concession (Child/Senior), and Off-peak categories. Total fare is calculated dynamically as the sum.</w:t>
+            </w:r>
+          </w:p>
+        </w:tc>
+        <w:tc>
+          <w:tcPr>
+            <w:tcW w:type="dxa" w:w="2200"/>
+          </w:tcPr>
+          <w:p>
+            <w:r>
+              <w:t>Affects UI screen S03 (quantity steppers and fare summary) and database schema (Tickets table with Quantity, UnitPrice, FareCategory).</w:t>
+            </w:r>
+          </w:p>
+        </w:tc>
+        <w:tc>
+          <w:tcPr>
+            <w:tcW w:type="dxa" w:w="1760"/>
+          </w:tcPr>
+          <w:p>
+            <w:r>
+              <w:t>FR2, DR3</w:t>
+            </w:r>
+          </w:p>
+        </w:tc>
+      </w:tr>
+      <w:tr>
+        <w:tc>
+          <w:tcPr>
+            <w:tcW w:type="dxa" w:w="800"/>
+          </w:tcPr>
+          <w:p>
+            <w:r>
+              <w:t>Q05</w:t>
+            </w:r>
+          </w:p>
+        </w:tc>
+        <w:tc>
+          <w:tcPr>
+            <w:tcW w:type="dxa" w:w="2300"/>
+          </w:tcPr>
+          <w:p>
+            <w:r>
+              <w:t>What is the system policy when a credit card payment is declined, and how many retry attempts are permitted before cancelling?</w:t>
+            </w:r>
+          </w:p>
+        </w:tc>
+        <w:tc>
+          <w:tcPr>
+            <w:tcW w:type="dxa" w:w="2300"/>
+          </w:tcPr>
+          <w:p>
+            <w:r>
+              <w:t>The TVM displays the specific decline reason (e.g. 'Insufficient funds' or 'Card read error'), retains the user's selected journey details, and allows up to 2 retry attempts or switching to QR/Digital Wallet before returning to the home screen.</w:t>
+            </w:r>
+          </w:p>
+        </w:tc>
+        <w:tc>
+          <w:tcPr>
+            <w:tcW w:type="dxa" w:w="2200"/>
+          </w:tcPr>
+          <w:p>
+            <w:r>
+              <w:t>Avoids frustrating passengers by not wiping their journey configuration on a single card error. Impacts State Chart (Declined state transition) and UI Screen S05/S07.</w:t>
+            </w:r>
+          </w:p>
+        </w:tc>
+        <w:tc>
+          <w:tcPr>
+            <w:tcW w:type="dxa" w:w="1760"/>
+          </w:tcPr>
+          <w:p>
+            <w:r>
+              <w:t>FR3, FR5, NFR1</w:t>
+            </w:r>
+          </w:p>
+        </w:tc>
+      </w:tr>
+      <w:tr>
+        <w:tc>
+          <w:tcPr>
+            <w:tcW w:type="dxa" w:w="800"/>
+          </w:tcPr>
+          <w:p>
+            <w:r>
+              <w:t>Q06</w:t>
+            </w:r>
+          </w:p>
+        </w:tc>
+        <w:tc>
+          <w:tcPr>
+            <w:tcW w:type="dxa" w:w="2300"/>
+          </w:tcPr>
+          <w:p>
+            <w:r>
+              <w:t>How should the TVM behave during network disconnections from the central server or payment gateway?</w:t>
+            </w:r>
+          </w:p>
+        </w:tc>
+        <w:tc>
+          <w:tcPr>
+            <w:tcW w:type="dxa" w:w="2300"/>
+          </w:tcPr>
+          <w:p>
+            <w:r>
+              <w:t>If central server connection is lost, TVM operates in standalone mode using locally cached station/fare tables and local in-memory transaction buffer; if payment gateway is unreachable, card/QR options show 'Temporarily Unavailable' and notify central monitoring.</w:t>
+            </w:r>
+          </w:p>
+        </w:tc>
+        <w:tc>
+          <w:tcPr>
+            <w:tcW w:type="dxa" w:w="2200"/>
+          </w:tcPr>
+          <w:p>
+            <w:r>
+              <w:t>Requires local fallback database cache (implemented via in-memory repository in C# demo) and health check monitoring heartbeat.</w:t>
+            </w:r>
+          </w:p>
+        </w:tc>
+        <w:tc>
+          <w:tcPr>
+            <w:tcW w:type="dxa" w:w="1760"/>
+          </w:tcPr>
+          <w:p>
+            <w:r>
+              <w:t>NFR3, FR8</w:t>
+            </w:r>
+          </w:p>
+        </w:tc>
+      </w:tr>
+      <w:tr>
+        <w:tc>
+          <w:tcPr>
+            <w:tcW w:type="dxa" w:w="800"/>
+          </w:tcPr>
+          <w:p>
+            <w:r>
+              <w:t>Q07</w:t>
+            </w:r>
+          </w:p>
+        </w:tc>
+        <w:tc>
+          <w:tcPr>
+            <w:tcW w:type="dxa" w:w="2300"/>
+          </w:tcPr>
+          <w:p>
+            <w:r>
+              <w:t>What barcode encoding format should be used, and what data payload must be encoded into the barcode to validate transit entry gates?</w:t>
+            </w:r>
+          </w:p>
+        </w:tc>
+        <w:tc>
+          <w:tcPr>
+            <w:tcW w:type="dxa" w:w="2300"/>
+          </w:tcPr>
+          <w:p>
+            <w:r>
+              <w:t>Use Code128 / PDF417 or QR code encoding a digitally signed payload containing TicketID, Origin Station, Destination Station, Issue Timestamp, and a SHA-256 HMAC verification hash valid for 2 hours from issuance.</w:t>
+            </w:r>
+          </w:p>
+        </w:tc>
+        <w:tc>
+          <w:tcPr>
+            <w:tcW w:type="dxa" w:w="2200"/>
+          </w:tcPr>
+          <w:p>
+            <w:r>
+              <w:t>Prevents ticket duplication and counterfeiting. Directly implemented in C# BarcodeRenderer and Ticket output screen (Screen S10).</w:t>
+            </w:r>
+          </w:p>
+        </w:tc>
+        <w:tc>
+          <w:tcPr>
+            <w:tcW w:type="dxa" w:w="1760"/>
+          </w:tcPr>
+          <w:p>
+            <w:r>
+              <w:t>FR6, DR1, NFR4</w:t>
+            </w:r>
+          </w:p>
+        </w:tc>
+      </w:tr>
+      <w:tr>
+        <w:tc>
+          <w:tcPr>
+            <w:tcW w:type="dxa" w:w="800"/>
+          </w:tcPr>
+          <w:p>
+            <w:r>
+              <w:t>Q08</w:t>
+            </w:r>
+          </w:p>
+        </w:tc>
+        <w:tc>
+          <w:tcPr>
+            <w:tcW w:type="dxa" w:w="2300"/>
+          </w:tcPr>
+          <w:p>
+            <w:r>
+              <w:t>Does this TVM version support multi-line interchange tickets (e.g. MRT Riverside Line to Central Bus Loop), or is it restricted to single-line journeys?</w:t>
+            </w:r>
+          </w:p>
+        </w:tc>
+        <w:tc>
+          <w:tcPr>
+            <w:tcW w:type="dxa" w:w="2300"/>
+          </w:tcPr>
+          <w:p>
+            <w:r>
+              <w:t>For Phase 1-4 prototype, the kiosk focuses on the primary MetroLink Riverside Line (7 stations). Transfer routing is reserved for Phase 5 enterprise release.</w:t>
+            </w:r>
+          </w:p>
+        </w:tc>
+        <w:tc>
+          <w:tcPr>
+            <w:tcW w:type="dxa" w:w="2200"/>
+          </w:tcPr>
+          <w:p>
+            <w:r>
+              <w:t>Keeps prototype scope clearly bounded while demonstrating full end-to-end functionality; architecture designed modularly to support future line plugins.</w:t>
+            </w:r>
+          </w:p>
+        </w:tc>
+        <w:tc>
+          <w:tcPr>
+            <w:tcW w:type="dxa" w:w="1760"/>
+          </w:tcPr>
+          <w:p>
+            <w:r>
+              <w:t>FR1, DR2</w:t>
+            </w:r>
+          </w:p>
+        </w:tc>
+      </w:tr>
     </w:tbl>
     <w:p>
       <w:pPr>
@@ -9752,13 +10012,53 @@
         <w:spacing w:before="60" w:after="140"/>
         <w:jc w:val="center"/>
       </w:pPr>
+      <w:r/>
+      <w:r>
+        <w:drawing>
+          <wp:inline xmlns:a="http://schemas.openxmlformats.org/drawingml/2006/main" xmlns:pic="http://schemas.openxmlformats.org/drawingml/2006/picture">
+            <wp:extent cx="5669280" cy="3629971"/>
+            <wp:docPr id="16" name="Picture 16"/>
+            <wp:cNvGraphicFramePr>
+              <a:graphicFrameLocks noChangeAspect="1"/>
+            </wp:cNvGraphicFramePr>
+            <a:graphic>
+              <a:graphicData uri="http://schemas.openxmlformats.org/drawingml/2006/picture">
+                <pic:pic>
+                  <pic:nvPicPr>
+                    <pic:cNvPr id="0" name="use_case_diagram.png"/>
+                    <pic:cNvPicPr/>
+                  </pic:nvPicPr>
+                  <pic:blipFill>
+                    <a:blip r:embed="rId33"/>
+                    <a:stretch>
+                      <a:fillRect/>
+                    </a:stretch>
+                  </pic:blipFill>
+                  <pic:spPr>
+                    <a:xfrm>
+                      <a:off x="0" y="0"/>
+                      <a:ext cx="5669280" cy="3629971"/>
+                    </a:xfrm>
+                    <a:prstGeom prst="rect"/>
+                  </pic:spPr>
+                </pic:pic>
+              </a:graphicData>
+            </a:graphic>
+          </wp:inline>
+        </w:drawing>
+      </w:r>
+    </w:p>
+    <w:p>
+      <w:pPr>
+        <w:jc w:val="center"/>
+      </w:pPr>
       <w:r>
         <w:rPr>
-          <w:color w:val="1F4E9A"/>
-          <w:sz w:val="20"/>
-          <w:szCs w:val="20"/>
+          <w:i/>
+          <w:color w:val="333333"/>
+          <w:sz w:val="19"/>
         </w:rPr>
-        <w:t>[ Use case diagram ]</w:t>
+        <w:t>Figure 3.1: Use Case Diagram – Smart Ticketing Machine (TVM)</w:t>
       </w:r>
     </w:p>
     <w:p>
@@ -12110,8 +12410,6 @@
           <w:sz w:val="20"/>
           <w:szCs w:val="20"/>
         </w:rPr>
-        <w:lastRenderedPageBreak/>
-        <w:t>[ Activity diagram: buy a ticket ]</w:t>
       </w:r>
       <w:r>
         <w:rPr>
@@ -12162,6 +12460,19 @@
     </w:p>
     <w:p>
       <w:pPr>
+        <w:jc w:val="center"/>
+      </w:pPr>
+      <w:r>
+        <w:rPr>
+          <w:i/>
+          <w:color w:val="333333"/>
+          <w:sz w:val="19"/>
+        </w:rPr>
+        <w:t>Figure 3.2: Activity Diagram – Passenger Buys a Ticket at the TVM</w:t>
+      </w:r>
+    </w:p>
+    <w:p>
+      <w:pPr>
         <w:pStyle w:val="Heading3"/>
         <w:keepNext/>
       </w:pPr>
@@ -12193,7 +12504,6 @@
           <w:sz w:val="20"/>
           <w:szCs w:val="20"/>
         </w:rPr>
-        <w:t>[ Activity diagram: payment gateway integration ]</w:t>
       </w:r>
       <w:r>
         <w:rPr>
@@ -12244,6 +12554,19 @@
     </w:p>
     <w:p>
       <w:pPr>
+        <w:jc w:val="center"/>
+      </w:pPr>
+      <w:r>
+        <w:rPr>
+          <w:i/>
+          <w:color w:val="333333"/>
+          <w:sz w:val="19"/>
+        </w:rPr>
+        <w:t>Figure 3.3: Activity Diagram – External Payment Gateway Integration</w:t>
+      </w:r>
+    </w:p>
+    <w:p>
+      <w:pPr>
         <w:pStyle w:val="Heading2"/>
         <w:keepNext/>
       </w:pPr>
@@ -12269,29 +12592,6 @@
         <w:spacing w:after="100" w:line="260" w:lineRule="auto"/>
       </w:pPr>
       <w:r/>
-    </w:p>
-    <w:p>
-      <w:pPr>
-        <w:pBdr>
-          <w:top w:val="dashed" w:sz="4" w:space="6" w:color="B7C3D3"/>
-          <w:bottom w:val="dashed" w:sz="4" w:space="6" w:color="B7C3D3"/>
-        </w:pBdr>
-        <w:spacing w:before="60" w:after="140"/>
-        <w:jc w:val="center"/>
-        <w:rPr>
-          <w:color w:val="1F4E9A"/>
-          <w:sz w:val="20"/>
-          <w:szCs w:val="20"/>
-        </w:rPr>
-      </w:pPr>
-      <w:r>
-        <w:rPr>
-          <w:color w:val="1F4E9A"/>
-          <w:sz w:val="20"/>
-          <w:szCs w:val="20"/>
-        </w:rPr>
-        <w:t>[ Sequence diagram: Buy a Ticket ]</w:t>
-      </w:r>
     </w:p>
     <w:p>
       <w:pPr>
@@ -12352,6 +12652,19 @@
     </w:p>
     <w:p>
       <w:pPr>
+        <w:jc w:val="center"/>
+      </w:pPr>
+      <w:r>
+        <w:rPr>
+          <w:i/>
+          <w:color w:val="333333"/>
+          <w:sz w:val="19"/>
+        </w:rPr>
+        <w:t>Figure 3.4: Sequence Diagram – Main Use Case 'Buy a Ticket'</w:t>
+      </w:r>
+    </w:p>
+    <w:p>
+      <w:pPr>
         <w:pStyle w:val="Heading3"/>
         <w:keepNext/>
       </w:pPr>
@@ -12382,8 +12695,6 @@
           <w:sz w:val="20"/>
           <w:szCs w:val="20"/>
         </w:rPr>
-        <w:lastRenderedPageBreak/>
-        <w:t>[ State chart diagram ]</w:t>
       </w:r>
       <w:r>
         <w:rPr>
@@ -12434,6 +12745,19 @@
     </w:p>
     <w:p>
       <w:pPr>
+        <w:jc w:val="center"/>
+      </w:pPr>
+      <w:r>
+        <w:rPr>
+          <w:i/>
+          <w:color w:val="333333"/>
+          <w:sz w:val="19"/>
+        </w:rPr>
+        <w:t>Figure 3.5: State Chart Diagram – TVM Transaction Lifecycle</w:t>
+      </w:r>
+    </w:p>
+    <w:p>
+      <w:pPr>
         <w:pStyle w:val="Heading3"/>
         <w:keepNext/>
       </w:pPr>
@@ -12449,29 +12773,6 @@
         <w:spacing w:after="100" w:line="260" w:lineRule="auto"/>
       </w:pPr>
       <w:r/>
-    </w:p>
-    <w:p>
-      <w:pPr>
-        <w:pBdr>
-          <w:top w:val="dashed" w:sz="4" w:space="6" w:color="B7C3D3"/>
-          <w:bottom w:val="dashed" w:sz="4" w:space="6" w:color="B7C3D3"/>
-        </w:pBdr>
-        <w:spacing w:before="60" w:after="140"/>
-        <w:jc w:val="center"/>
-        <w:rPr>
-          <w:color w:val="1F4E9A"/>
-          <w:sz w:val="20"/>
-          <w:szCs w:val="20"/>
-        </w:rPr>
-      </w:pPr>
-      <w:r>
-        <w:rPr>
-          <w:color w:val="1F4E9A"/>
-          <w:sz w:val="20"/>
-          <w:szCs w:val="20"/>
-        </w:rPr>
-        <w:t>[ Class diagram ]</w:t>
-      </w:r>
     </w:p>
     <w:p>
       <w:pPr>
@@ -12527,6 +12828,19 @@
             </a:graphic>
           </wp:inline>
         </w:drawing>
+      </w:r>
+    </w:p>
+    <w:p>
+      <w:pPr>
+        <w:jc w:val="center"/>
+      </w:pPr>
+      <w:r>
+        <w:rPr>
+          <w:i/>
+          <w:color w:val="333333"/>
+          <w:sz w:val="19"/>
+        </w:rPr>
+        <w:t>Figure 3.6: Domain Class Diagram – Smart Ticketing System</w:t>
       </w:r>
     </w:p>
     <w:tbl>
@@ -16502,29 +16816,6 @@
         </w:pBdr>
         <w:spacing w:before="60" w:after="140"/>
         <w:jc w:val="center"/>
-        <w:rPr>
-          <w:color w:val="1F4E9A"/>
-          <w:sz w:val="20"/>
-          <w:szCs w:val="20"/>
-        </w:rPr>
-      </w:pPr>
-      <w:r>
-        <w:rPr>
-          <w:color w:val="1F4E9A"/>
-          <w:sz w:val="20"/>
-          <w:szCs w:val="20"/>
-        </w:rPr>
-        <w:t>[ Wireframes or mockups of the screens (one per screen) ]</w:t>
-      </w:r>
-    </w:p>
-    <w:p>
-      <w:pPr>
-        <w:pBdr>
-          <w:top w:val="dashed" w:sz="4" w:space="6" w:color="B7C3D3"/>
-          <w:bottom w:val="dashed" w:sz="4" w:space="6" w:color="B7C3D3"/>
-        </w:pBdr>
-        <w:spacing w:before="60" w:after="140"/>
-        <w:jc w:val="center"/>
       </w:pPr>
       <w:r>
         <w:lastRenderedPageBreak/>
@@ -16567,6 +16858,19 @@
     </w:p>
     <w:p>
       <w:pPr>
+        <w:jc w:val="center"/>
+      </w:pPr>
+      <w:r>
+        <w:rPr>
+          <w:i/>
+          <w:color w:val="333333"/>
+          <w:sz w:val="19"/>
+        </w:rPr>
+        <w:t>Figure 4.1: UI/UX Wireframes &amp; Mockups – MetroLink TVM Kiosk (Figma)</w:t>
+      </w:r>
+    </w:p>
+    <w:p>
+      <w:pPr>
         <w:pStyle w:val="Heading2"/>
         <w:keepNext/>
       </w:pPr>
@@ -16592,29 +16896,6 @@
         <w:spacing w:after="100" w:line="260" w:lineRule="auto"/>
       </w:pPr>
       <w:r/>
-    </w:p>
-    <w:p>
-      <w:pPr>
-        <w:pBdr>
-          <w:top w:val="dashed" w:sz="4" w:space="6" w:color="B7C3D3"/>
-          <w:bottom w:val="dashed" w:sz="4" w:space="6" w:color="B7C3D3"/>
-        </w:pBdr>
-        <w:spacing w:before="60" w:after="140"/>
-        <w:jc w:val="center"/>
-        <w:rPr>
-          <w:color w:val="1F4E9A"/>
-          <w:sz w:val="20"/>
-          <w:szCs w:val="20"/>
-        </w:rPr>
-      </w:pPr>
-      <w:r>
-        <w:rPr>
-          <w:color w:val="1F4E9A"/>
-          <w:sz w:val="20"/>
-          <w:szCs w:val="20"/>
-        </w:rPr>
-        <w:t>[ Architecture diagram ]</w:t>
-      </w:r>
     </w:p>
     <w:p>
       <w:pPr>
@@ -16675,15 +16956,31 @@
     </w:p>
     <w:p>
       <w:pPr>
+        <w:jc w:val="center"/>
+      </w:pPr>
+      <w:r>
+        <w:rPr>
+          <w:i/>
+          <w:color w:val="333333"/>
+          <w:sz w:val="19"/>
+        </w:rPr>
+        <w:t>Figure 4.2: Architectural Design – Layered MVC &amp; System-in-a-Box Pattern</w:t>
+      </w:r>
+    </w:p>
+    <w:p>
+      <w:pPr>
         <w:spacing w:after="100"/>
       </w:pPr>
       <w:r>
-        <w:rPr>
-          <w:color w:val="1F4E9A"/>
-          <w:sz w:val="21"/>
-          <w:szCs w:val="21"/>
-        </w:rPr>
-        <w:t>[Explanation and design reasoning]</w:t>
+        <w:t>Design Reasoning &amp; Architectural Explanation:</w:t>
+        <w:br/>
+        <w:t>The Smart Ticketing System is engineered around a decoupled three-tier Model-View-Controller (MVC) pattern adapted for an autonomous transit kiosk ('System-in-a-box'):</w:t>
+        <w:br/>
+        <w:t>1. Presentation Tier (View): Built with responsive Windows Forms touch kiosk components (MainForm, StepProgressBar, KioskTheme). The UI coordinates user interactions via an event-driven subscriber model, remaining strictly agnostic of underlying database engines and payment hardware protocols.</w:t>
+        <w:br/>
+        <w:t>2. Domain &amp; Application Logic Tier (Controller): Encapsulated within TVMController and domain service handlers (FareCalculationService, BarcodeService). State progression adheres to a strict finite state machine (Idle -&gt; Destination -&gt; TicketConfig -&gt; PaymentSelection -&gt; Processing -&gt; Dispensing -&gt; Completed), preventing invalid transactional transitions.</w:t>
+        <w:br/>
+        <w:t>3. Persistence &amp; Hardware Abstraction Tier (Model / HAL): Employs the Repository Pattern (ITicketRepository, IStationRepository) backed by Microsoft SQL Server (ADO.NET) with an automatic In-Memory fallback cache. Hardware peripherals (Barcode Scanner, Contactless Card Reader, Thermal Ticket Printer) interface via mockable driver contracts, ensuring high reliability, testability, and resilience during transient hardware or network disconnections.</w:t>
       </w:r>
     </w:p>
     <w:p>
@@ -16702,29 +16999,6 @@
         <w:spacing w:after="100" w:line="260" w:lineRule="auto"/>
       </w:pPr>
       <w:r/>
-    </w:p>
-    <w:p>
-      <w:pPr>
-        <w:pBdr>
-          <w:top w:val="dashed" w:sz="4" w:space="6" w:color="B7C3D3"/>
-          <w:bottom w:val="dashed" w:sz="4" w:space="6" w:color="B7C3D3"/>
-        </w:pBdr>
-        <w:spacing w:before="60" w:after="140"/>
-        <w:jc w:val="center"/>
-        <w:rPr>
-          <w:color w:val="1F4E9A"/>
-          <w:sz w:val="20"/>
-          <w:szCs w:val="20"/>
-        </w:rPr>
-      </w:pPr>
-      <w:r>
-        <w:rPr>
-          <w:color w:val="1F4E9A"/>
-          <w:sz w:val="20"/>
-          <w:szCs w:val="20"/>
-        </w:rPr>
-        <w:t>[ Deployment diagram ]</w:t>
-      </w:r>
     </w:p>
     <w:p>
       <w:pPr>
@@ -16783,6 +17057,19 @@
         </w:drawing>
       </w:r>
     </w:p>
+    <w:p>
+      <w:pPr>
+        <w:jc w:val="center"/>
+      </w:pPr>
+      <w:r>
+        <w:rPr>
+          <w:i/>
+          <w:color w:val="333333"/>
+          <w:sz w:val="19"/>
+        </w:rPr>
+        <w:t>Figure 4.3: Deployment Diagram – TVM Hardware, Local Controller &amp; External Gateways</w:t>
+      </w:r>
+    </w:p>
     <w:tbl>
       <w:tblPr>
         <w:tblW w:w="9360" w:type="dxa"/>
@@ -17437,13 +17724,40 @@
       <w:pPr>
         <w:spacing w:after="80" w:line="276" w:lineRule="auto" w:before="80"/>
       </w:pPr>
+      <w:r/>
       <w:r>
-        <w:rPr>
-          <w:rFonts w:ascii="Segoe UI" w:hAnsi="Segoe UI"/>
-          <w:b w:val="0"/>
-          <w:i w:val="0"/>
-          <w:sz w:val="20"/>
-        </w:rPr>
+        <w:drawing>
+          <wp:inline xmlns:a="http://schemas.openxmlformats.org/drawingml/2006/main" xmlns:pic="http://schemas.openxmlformats.org/drawingml/2006/picture">
+            <wp:extent cx="5486400" cy="3017520"/>
+            <wp:docPr id="17" name="Picture 17"/>
+            <wp:cNvGraphicFramePr>
+              <a:graphicFrameLocks noChangeAspect="1"/>
+            </wp:cNvGraphicFramePr>
+            <a:graphic>
+              <a:graphicData uri="http://schemas.openxmlformats.org/drawingml/2006/picture">
+                <pic:pic>
+                  <pic:nvPicPr>
+                    <pic:cNvPr id="0" name="image.png"/>
+                    <pic:cNvPicPr/>
+                  </pic:nvPicPr>
+                  <pic:blipFill>
+                    <a:blip r:embed="rId29"/>
+                    <a:stretch>
+                      <a:fillRect/>
+                    </a:stretch>
+                  </pic:blipFill>
+                  <pic:spPr>
+                    <a:xfrm>
+                      <a:off x="0" y="0"/>
+                      <a:ext cx="5486400" cy="3017520"/>
+                    </a:xfrm>
+                    <a:prstGeom prst="rect"/>
+                  </pic:spPr>
+                </pic:pic>
+              </a:graphicData>
+            </a:graphic>
+          </wp:inline>
+        </w:drawing>
       </w:r>
     </w:p>
     <w:p>
@@ -17489,37 +17803,12 @@
     </w:p>
     <w:p>
       <w:pPr>
-        <w:spacing w:after="80" w:before="80" w:line="276" w:lineRule="auto"/>
-      </w:pPr>
-      <w:r>
-        <w:rPr>
-          <w:rFonts w:ascii="Segoe UI" w:hAnsi="Segoe UI"/>
-          <w:b w:val="0"/>
-          <w:i w:val="0"/>
-          <w:sz w:val="20"/>
-        </w:rPr>
-        <w:t>Forward Engineering Workflow:</w:t>
-        <w:br/>
-        <w:t>1. Model Translation: The UML Class Diagram established in Section 3.3.3 was imported into Visual Studio 2022's Class Designer. The core domain entities (Station, Ticket, PaymentTransaction, CreditCardTransaction, DigitalWalletTransaction) and hardware peripherals (BarcodePrinter, CardReader, TVMController) were translated directly into C# class files within the SmartTicketing.Core class library project.</w:t>
-        <w:br/>
-        <w:t>2. Skeleton Generation: Visual Studio generated automatic C# property accessors ({ get; set; }), method signatures, and class inheritance hierarchies matching the domain model.</w:t>
-        <w:br/>
-        <w:t>3. Layered Decoupling: The generated domain classes were segregated into SmartTicketing.Core to ensure zero dependency on UI or specific database engines, fulfilling the Single Responsibility Principle (SRP).</w:t>
-      </w:r>
-    </w:p>
-    <w:p>
-      <w:pPr>
         <w:pStyle w:val="Heading3"/>
         <w:keepNext/>
         <w:spacing w:before="80" w:after="80" w:line="276" w:lineRule="auto"/>
       </w:pPr>
       <w:r>
-        <w:rPr>
-          <w:rFonts w:ascii="Segoe UI" w:hAnsi="Segoe UI"/>
-          <w:b w:val="0"/>
-          <w:i w:val="0"/>
-          <w:sz w:val="20"/>
-        </w:rPr>
+        <w:t>5.1.2 Backward Engineering (Code to Model)</w:t>
       </w:r>
     </w:p>
     <w:p>
@@ -18083,44 +18372,12 @@
     </w:tbl>
     <w:p>
       <w:pPr>
-        <w:pBdr>
-          <w:top w:val="dashed" w:sz="4" w:space="6" w:color="B7C3D3"/>
-          <w:bottom w:val="dashed" w:sz="4" w:space="6" w:color="B7C3D3"/>
-        </w:pBdr>
-        <w:spacing w:before="80" w:after="80" w:line="276" w:lineRule="auto"/>
-        <w:jc w:val="center"/>
-      </w:pPr>
-      <w:r>
-        <w:rPr>
-          <w:rFonts w:ascii="Segoe UI" w:hAnsi="Segoe UI"/>
-          <w:b w:val="0"/>
-          <w:i w:val="0"/>
-          <w:sz w:val="20"/>
-        </w:rPr>
-        <w:t>Backward Engineering Reflection:</w:t>
-        <w:br/>
-        <w:t>Following initial skeleton generation, manual implementation of real-world hardware and transaction handling required four architectural refinements (documented in Table 13 above). Using Visual Studio 2022, the compiled code modifications were reverse-engineered back into the UML architecture:</w:t>
-        <w:br/>
-        <w:t>• Asynchronous method signatures (Task&lt;bool&gt; ProcessAsync()) were reflected back to UML operations.</w:t>
-        <w:br/>
-        <w:t>• StateChanged and QRCountdownTick event delegates were reverse-mapped to the TVMController interface.</w:t>
-        <w:br/>
-        <w:t>• The FareCategory domain enum was integrated into the core UML Class Diagram with direct multiplicity to Ticket.</w:t>
-      </w:r>
-    </w:p>
-    <w:p>
-      <w:pPr>
         <w:pStyle w:val="Heading3"/>
         <w:keepNext/>
         <w:spacing w:before="80" w:after="80" w:line="276" w:lineRule="auto"/>
       </w:pPr>
       <w:r>
-        <w:rPr>
-          <w:rFonts w:ascii="Segoe UI" w:hAnsi="Segoe UI"/>
-          <w:b w:val="0"/>
-          <w:i w:val="0"/>
-          <w:sz w:val="20"/>
-        </w:rPr>
+        <w:t>5.1.3 Visual Studio Architecture Code Map</w:t>
       </w:r>
     </w:p>
     <w:p>
@@ -18211,41 +18468,12 @@
     </w:p>
     <w:p>
       <w:pPr>
-        <w:spacing w:after="80" w:before="80" w:line="276" w:lineRule="auto"/>
-      </w:pPr>
-      <w:r>
-        <w:rPr>
-          <w:rFonts w:ascii="Segoe UI" w:hAnsi="Segoe UI"/>
-          <w:b w:val="0"/>
-          <w:i w:val="0"/>
-          <w:sz w:val="20"/>
-        </w:rPr>
-        <w:t>Visual Studio Code Map Analysis:</w:t>
-        <w:br/>
-        <w:t>The Visual Studio Code Map visualizes the compiled dependencies across the three assemblies of the solution:</w:t>
-        <w:br/>
-        <w:t>• SmartTicketing.UI.dll (Presentation Tier): Depends strictly downward on SmartTicketing.Core and SmartTicketing.Data. Coordinates kiosk views (MainForm) and UI rendering (BarcodeRenderer, UITheme).</w:t>
-        <w:br/>
-        <w:t>• SmartTicketing.Core.dll (Domain Tier): The core domain engine containing TVMController, Models, and Devices. It has zero external dependencies, ensuring maximum portability and testability.</w:t>
-        <w:br/>
-        <w:t>• SmartTicketing.Data.dll (Data Access Tier): Depends on SmartTicketing.Core and Microsoft.Data.SqlClient. Manages database transactions with MSSQL Server while providing an in-memory fallback mechanism if the SQL Server instance is unreachable.</w:t>
-        <w:br/>
-        <w:t>Conclusion: The architecture demonstrates strict High Cohesion and Low Coupling, preventing circular dependencies and ensuring maintainability.</w:t>
-      </w:r>
-    </w:p>
-    <w:p>
-      <w:pPr>
         <w:pStyle w:val="Heading2"/>
         <w:keepNext/>
         <w:spacing w:before="80" w:after="80" w:line="276" w:lineRule="auto"/>
       </w:pPr>
       <w:r>
-        <w:rPr>
-          <w:rFonts w:ascii="Segoe UI" w:hAnsi="Segoe UI"/>
-          <w:b w:val="0"/>
-          <w:i w:val="0"/>
-          <w:sz w:val="20"/>
-        </w:rPr>
+        <w:t>5.2 GitHub &amp; AI Tooling (Copilot) (10 marks)</w:t>
       </w:r>
     </w:p>
     <w:p>
@@ -20443,51 +20671,6 @@
     </w:p>
     <w:p>
       <w:pPr>
-        <w:pBdr>
-          <w:top w:val="dashed" w:sz="4" w:space="6" w:color="B7C3D3"/>
-          <w:bottom w:val="dashed" w:sz="4" w:space="6" w:color="B7C3D3"/>
-        </w:pBdr>
-        <w:spacing w:before="60" w:after="140"/>
-        <w:jc w:val="center"/>
-      </w:pPr>
-      <w:r/>
-      <w:r>
-        <w:drawing>
-          <wp:inline xmlns:a="http://schemas.openxmlformats.org/drawingml/2006/main" xmlns:pic="http://schemas.openxmlformats.org/drawingml/2006/picture">
-            <wp:extent cx="5303520" cy="3857105"/>
-            <wp:docPr id="14" name="Picture 14"/>
-            <wp:cNvGraphicFramePr>
-              <a:graphicFrameLocks noChangeAspect="1"/>
-            </wp:cNvGraphicFramePr>
-            <a:graphic>
-              <a:graphicData uri="http://schemas.openxmlformats.org/drawingml/2006/picture">
-                <pic:pic>
-                  <pic:nvPicPr>
-                    <pic:cNvPr id="0" name="image.png"/>
-                    <pic:cNvPicPr/>
-                  </pic:nvPicPr>
-                  <pic:blipFill>
-                    <a:blip r:embed="rId31"/>
-                    <a:stretch>
-                      <a:fillRect/>
-                    </a:stretch>
-                  </pic:blipFill>
-                  <pic:spPr>
-                    <a:xfrm>
-                      <a:off x="0" y="0"/>
-                      <a:ext cx="5303520" cy="3857105"/>
-                    </a:xfrm>
-                    <a:prstGeom prst="rect"/>
-                  </pic:spPr>
-                </pic:pic>
-              </a:graphicData>
-            </a:graphic>
-          </wp:inline>
-        </w:drawing>
-      </w:r>
-    </w:p>
-    <w:p>
-      <w:pPr>
         <w:keepNext/>
         <w:spacing w:before="80" w:after="80" w:line="276" w:lineRule="auto"/>
       </w:pPr>
@@ -20505,51 +20688,6 @@
         <w:t>2. Payment Gateway Integration: Due to academic sandbox constraints, external payment gateway communication (Napas, Momo, VNPay) is executed against simulated RESTful API endpoints matching production IPN webhook specifications.</w:t>
         <w:br/>
         <w:t>3. Single Line Scope: The current demonstration model implements Line 01 (Riverside Line) comprising 7 stations; multi-line transfer routing is architected for Phase 2 expansion.</w:t>
-      </w:r>
-    </w:p>
-    <w:p>
-      <w:pPr>
-        <w:pBdr>
-          <w:top w:val="dashed" w:sz="4" w:space="6" w:color="B7C3D3"/>
-          <w:bottom w:val="dashed" w:sz="4" w:space="6" w:color="B7C3D3"/>
-        </w:pBdr>
-        <w:spacing w:before="60" w:after="140"/>
-        <w:jc w:val="center"/>
-      </w:pPr>
-      <w:r/>
-      <w:r>
-        <w:drawing>
-          <wp:inline xmlns:a="http://schemas.openxmlformats.org/drawingml/2006/main" xmlns:pic="http://schemas.openxmlformats.org/drawingml/2006/picture">
-            <wp:extent cx="5303520" cy="3857105"/>
-            <wp:docPr id="15" name="Picture 15"/>
-            <wp:cNvGraphicFramePr>
-              <a:graphicFrameLocks noChangeAspect="1"/>
-            </wp:cNvGraphicFramePr>
-            <a:graphic>
-              <a:graphicData uri="http://schemas.openxmlformats.org/drawingml/2006/picture">
-                <pic:pic>
-                  <pic:nvPicPr>
-                    <pic:cNvPr id="0" name="image.png"/>
-                    <pic:cNvPicPr/>
-                  </pic:nvPicPr>
-                  <pic:blipFill>
-                    <a:blip r:embed="rId32"/>
-                    <a:stretch>
-                      <a:fillRect/>
-                    </a:stretch>
-                  </pic:blipFill>
-                  <pic:spPr>
-                    <a:xfrm>
-                      <a:off x="0" y="0"/>
-                      <a:ext cx="5303520" cy="3857105"/>
-                    </a:xfrm>
-                    <a:prstGeom prst="rect"/>
-                  </pic:spPr>
-                </pic:pic>
-              </a:graphicData>
-            </a:graphic>
-          </wp:inline>
-        </w:drawing>
       </w:r>
     </w:p>
     <w:p>
@@ -21229,22 +21367,6 @@
     </w:tbl>
     <w:p>
       <w:pPr>
-        <w:keepNext/>
-        <w:spacing w:before="80" w:after="40"/>
-      </w:pPr>
-      <w:r>
-        <w:rPr>
-          <w:b/>
-          <w:bCs/>
-          <w:sz w:val="21"/>
-          <w:szCs w:val="21"/>
-        </w:rPr>
-        <w:lastRenderedPageBreak/>
-        <w:t>Known limitations</w:t>
-      </w:r>
-    </w:p>
-    <w:p>
-      <w:pPr>
         <w:spacing w:after="80" w:before="80" w:line="276" w:lineRule="auto"/>
       </w:pPr>
       <w:r>
@@ -21278,32 +21400,6 @@
       </w:r>
       <w:bookmarkEnd w:id="39"/>
     </w:p>
-    <w:p>
-      <w:pPr>
-        <w:spacing w:after="80" w:line="276" w:lineRule="auto" w:before="80"/>
-      </w:pPr>
-      <w:r>
-        <w:rPr>
-          <w:rFonts w:ascii="Segoe UI" w:hAnsi="Segoe UI"/>
-          <w:b w:val="0"/>
-          <w:i w:val="0"/>
-          <w:sz w:val="20"/>
-        </w:rPr>
-        <w:t>Conclusion and Lessons Learnt:</w:t>
-        <w:br/>
-        <w:t>Through Group Assignment 1, Group 14 successfully executed the complete software engineering lifecycle for the Ticket Vendor Machine (TVM) of the Smart Ticketing System:</w:t>
-        <w:br/>
-        <w:t>• Thorough Requirements Engineering: Ambiguities in transit fare and hardware timeout rules were systematically resolved through structured Q&amp;A, producing measurable NFR metrics (&lt; 1.0s station list rendering, &lt; 2.0s QR generation, 99.9% uptime).</w:t>
-        <w:br/>
-        <w:t>• Rigorous UML Design: Activity, Sequence, State Chart, and Class diagrams were fully aligned, guaranteeing behavioral and structural consistency.</w:t>
-        <w:br/>
-        <w:t>• Bidirectional Visual Studio Engineering: Forward and backward model-to-code transformations were successfully demonstrated using Visual Studio 2022.</w:t>
-        <w:br/>
-        <w:t>• Professional Prototype Demo: A production-quality C# WinForms application and MSSQL Server schema were developed, faithfully replicating the modern Figma MetroLink kiosk experience with comprehensive exception handling.</w:t>
-        <w:br/>
-        <w:t>• Collaboration: The project was managed collaboratively via GitHub, leveraging modern AI tooling while maintaining strict software engineering discipline.</w:t>
-      </w:r>
-    </w:p>
     <w:tbl>
       <w:tblPr>
         <w:tblW w:w="9360" w:type="dxa"/>
@@ -22476,30 +22572,6 @@
         <w:t>7. Contribution of Each Member</w:t>
       </w:r>
       <w:bookmarkEnd w:id="40"/>
-    </w:p>
-    <w:p>
-      <w:pPr>
-        <w:spacing w:after="80" w:line="276" w:lineRule="auto" w:before="80"/>
-      </w:pPr>
-      <w:r>
-        <w:rPr>
-          <w:rFonts w:ascii="Segoe UI" w:hAnsi="Segoe UI"/>
-          <w:b w:val="0"/>
-          <w:i w:val="0"/>
-          <w:sz w:val="20"/>
-        </w:rPr>
-        <w:t>References:</w:t>
-        <w:br/>
-        <w:t>1. Ky-Trung Pham, Software Engineering Lab Lecture Notes &amp; Assignment 1 Guidelines (Sem 1_2627), Ton Duc Thang University, Sep 2026.</w:t>
-        <w:br/>
-        <w:t>2. Ian Sommerville, Software Engineering, 10th Edition, Pearson Education, 2016.</w:t>
-        <w:br/>
-        <w:t>3. Microsoft Learn, Visual Studio Architecture &amp; Modeling Tools: Code Maps and Class Diagrams, 2024.</w:t>
-        <w:br/>
-        <w:t>4. PCI Security Standards Council, Payment Card Industry Data Security Standard (PCI-DSS) v4.0, 2023.</w:t>
-        <w:br/>
-        <w:t>5. MetroLink Figma UI/UX Community Design System, 2026.</w:t>
-      </w:r>
     </w:p>
     <w:tbl>
       <w:tblPr>
@@ -23187,65 +23259,9 @@
     <w:p>
       <w:pPr>
         <w:pStyle w:val="Heading1"/>
-        <w:keepNext/>
-        <w:spacing w:before="80" w:after="80" w:line="276" w:lineRule="auto"/>
       </w:pPr>
       <w:r>
-        <w:rPr>
-          <w:rFonts w:ascii="Segoe UI" w:hAnsi="Segoe UI"/>
-          <w:b w:val="0"/>
-          <w:i w:val="0"/>
-          <w:sz w:val="20"/>
-        </w:rPr>
-        <w:t>================================================================================</w:t>
-        <w:br/>
-        <w:t>SMART TICKETING SYSTEM - TICKET VENDOR MACHINE (TVM)</w:t>
-        <w:br/>
-        <w:t>Software Engineering Lab - Group Assignment 1 | Group 14</w:t>
-        <w:br/>
-        <w:t>================================================================================</w:t>
-        <w:br/>
-        <w:br/>
-        <w:t>1. GitHub Repository Link:</w:t>
-        <w:br/>
-        <w:t>https://github.com/seuquay56/SmartTicketingSystem_TVM.git</w:t>
-        <w:br/>
-        <w:br/>
-        <w:t>2. Figma UI/UX Design Link:</w:t>
-        <w:br/>
-        <w:t>https://www.figma.com/design/LbKhf6mQOvEtakarW24O3d/Vending-Machine-UI--Community-?node-id=2004-20053</w:t>
-        <w:br/>
-        <w:br/>
-        <w:t>3. Database Script &amp; Setup Instructions:</w:t>
-        <w:br/>
-        <w:t>- Database Engine: Microsoft SQL Server (MSSQL Server 2022 / LocalDB)</w:t>
-        <w:br/>
-        <w:t>- Script Path: /Database/Script.sql</w:t>
-        <w:br/>
-        <w:t>- Execution Steps:</w:t>
-        <w:br/>
-        <w:t xml:space="preserve">  1. Open SQL Server Management Studio (SSMS) or Azure Data Studio.</w:t>
-        <w:br/>
-        <w:t xml:space="preserve">  2. Connect to your local server instance (e.g. localhost or (localdb)\MSSQLLocalDB).</w:t>
-        <w:br/>
-        <w:t xml:space="preserve">  3. Open 'Database/Script.sql' and execute to generate SmartTicketingDB and sample data.</w:t>
-        <w:br/>
-        <w:t xml:space="preserve">  4. Open 'SmartTicketingSystem_TVM.sln' in Visual Studio 2022 and press F5.</w:t>
-        <w:br/>
-        <w:t xml:space="preserve">  (Note: The application includes intelligent In-Memory seed auto-fallback if SQL Server is not active).</w:t>
-        <w:br/>
-        <w:br/>
-        <w:t>4. Member Contribution Breakdown:</w:t>
-        <w:br/>
-        <w:t>1. 524H0057 - On Gia Khiem: 30%</w:t>
-        <w:br/>
-        <w:t>2. 524H0069 - Vo Nguyen Phuc Thinh: 40%</w:t>
-        <w:br/>
-        <w:t>3. 524H0052 - Nguyen Nhat Huy: 30%</w:t>
-        <w:br/>
-        <w:t>Total: 100%</w:t>
-        <w:br/>
-        <w:t>================================================================================</w:t>
+        <w:t>9. References</w:t>
       </w:r>
     </w:p>
     <w:p>
@@ -23270,23 +23286,6 @@
         <w:t>4. PCI Security Standards Council, Payment Card Industry Data Security Standard (PCI-DSS) v4.0, 2023.</w:t>
         <w:br/>
         <w:t>5. MetroLink Figma UI/UX Community Design System, 2026.</w:t>
-      </w:r>
-    </w:p>
-    <w:p>
-      <w:pPr>
-        <w:pStyle w:val="Heading1"/>
-        <w:keepNext/>
-        <w:pageBreakBefore/>
-        <w:spacing w:before="80" w:after="80" w:line="276" w:lineRule="auto"/>
-      </w:pPr>
-      <w:r>
-        <w:rPr>
-          <w:rFonts w:ascii="Segoe UI" w:hAnsi="Segoe UI"/>
-          <w:b w:val="0"/>
-          <w:i w:val="0"/>
-          <w:sz w:val="20"/>
-        </w:rPr>
-        <w:t>Full-size diagrams for Use Case, Activity, Sequence, State Chart, Class, Architecture, Deployment, and Code Maps are archived in high-resolution PNG format in the project repository under /Screenshots and embedded throughout Sections 3, 4, and 5 of this report.</w:t>
       </w:r>
     </w:p>
     <w:p>

</xml_diff>